<commit_message>
refactor: improve BAST PDF layout and signature formatting with page breaks and dynamic positions
</commit_message>
<xml_diff>
--- a/app/Views/admin/kontrak/bast_template.docx
+++ b/app/Views/admin/kontrak/bast_template.docx
@@ -1034,6 +1034,7 @@
     </w:p>
     <w:p>
       <w:pPr>
+        <w:pageBreakBefore/>
         <w:spacing w:before="200" w:after="60"/>
         <w:rPr>
           <w:rFonts w:ascii="Arial" w:hAnsi="Arial" w:cs="Arial"/>
@@ -2111,6 +2112,12 @@
               <w:bottom w:val="none" w:sz="0" w:space="0" w:color="FFFFFF"/>
               <w:right w:val="none" w:sz="0" w:space="0" w:color="FFFFFF"/>
             </w:tcBorders>
+            <w:tcMar>
+              <w:top w:w="0" w:type="dxa"/>
+              <w:bottom w:w="0" w:type="dxa"/>
+              <w:left w:w="0" w:type="dxa"/>
+              <w:right w:w="0" w:type="dxa"/>
+            </w:tcMar>
           </w:tcPr>
           <w:p>
             <w:pPr>
@@ -2153,137 +2160,6 @@
                 <w:szCs w:val="22"/>
               </w:rPr>
               <w:t xml:space="preserve">${penyedia_nama}</w:t>
-            </w:r>
-          </w:p>
-          <w:p>
-            <w:pPr>
-              <w:pBdr>
-                <w:top w:val="nil"/>
-                <w:left w:val="nil"/>
-                <w:bottom w:val="nil"/>
-                <w:right w:val="nil"/>
-                <w:between w:val="nil"/>
-              </w:pBdr>
-              <w:spacing w:line="276" w:lineRule="auto"/>
-              <w:rPr>
-                <w:rFonts w:ascii="Arial" w:eastAsia="Basic" w:hAnsi="Arial" w:cs="Arial"/>
-                <w:b/>
-                <w:bCs/>
-              </w:rPr>
-            </w:pPr>
-          </w:p>
-          <w:p>
-            <w:pPr>
-              <w:pBdr>
-                <w:top w:val="nil"/>
-                <w:left w:val="nil"/>
-                <w:bottom w:val="nil"/>
-                <w:right w:val="nil"/>
-                <w:between w:val="nil"/>
-              </w:pBdr>
-              <w:spacing w:line="276" w:lineRule="auto"/>
-              <w:rPr>
-                <w:rFonts w:ascii="Arial" w:eastAsia="Basic" w:hAnsi="Arial" w:cs="Arial"/>
-                <w:b/>
-                <w:bCs/>
-              </w:rPr>
-            </w:pPr>
-          </w:p>
-          <w:p>
-            <w:pPr>
-              <w:pBdr>
-                <w:top w:val="nil"/>
-                <w:left w:val="nil"/>
-                <w:bottom w:val="nil"/>
-                <w:right w:val="nil"/>
-                <w:between w:val="nil"/>
-              </w:pBdr>
-              <w:spacing w:line="276" w:lineRule="auto"/>
-              <w:rPr>
-                <w:rFonts w:ascii="Arial" w:eastAsia="Basic" w:hAnsi="Arial" w:cs="Arial"/>
-                <w:b/>
-                <w:bCs/>
-              </w:rPr>
-            </w:pPr>
-          </w:p>
-          <w:p>
-            <w:pPr>
-              <w:pBdr>
-                <w:top w:val="nil"/>
-                <w:left w:val="nil"/>
-                <w:bottom w:val="nil"/>
-                <w:right w:val="nil"/>
-                <w:between w:val="nil"/>
-              </w:pBdr>
-              <w:spacing w:line="276" w:lineRule="auto"/>
-              <w:rPr>
-                <w:rFonts w:ascii="Arial" w:eastAsia="Basic" w:hAnsi="Arial" w:cs="Arial"/>
-                <w:b/>
-                <w:bCs/>
-              </w:rPr>
-            </w:pPr>
-          </w:p>
-          <w:p>
-            <w:pPr>
-              <w:pBdr>
-                <w:top w:val="nil"/>
-                <w:left w:val="nil"/>
-                <w:bottom w:val="nil"/>
-                <w:right w:val="nil"/>
-                <w:between w:val="nil"/>
-              </w:pBdr>
-              <w:spacing w:line="276" w:lineRule="auto"/>
-              <w:rPr>
-                <w:rFonts w:ascii="Arial" w:eastAsia="Basic" w:hAnsi="Arial" w:cs="Arial"/>
-                <w:b/>
-                <w:bCs/>
-              </w:rPr>
-            </w:pPr>
-          </w:p>
-          <w:p>
-            <w:pPr>
-              <w:pBdr>
-                <w:top w:val="nil"/>
-                <w:left w:val="nil"/>
-                <w:bottom w:val="nil"/>
-                <w:right w:val="nil"/>
-                <w:between w:val="nil"/>
-              </w:pBdr>
-              <w:spacing w:line="276" w:lineRule="auto"/>
-              <w:jc w:val="center"/>
-              <w:rPr>
-                <w:rFonts w:ascii="Arial" w:eastAsia="Basic" w:hAnsi="Arial" w:cs="Arial"/>
-                <w:b/>
-                <w:bCs/>
-                <w:u w:val="single"/>
-                <w:lang w:val="en-US"/>
-              </w:rPr>
-            </w:pPr>
-            <w:r>
-              <w:rPr>
-                <w:rFonts w:ascii="Arial" w:eastAsia="Basic" w:hAnsi="Arial" w:cs="Arial"/>
-                <w:b/>
-                <w:bCs/>
-                <w:u w:val="single"/>
-                <w:lang w:val="en-US"/>
-              </w:rPr>
-              <w:t xml:space="preserve">${penyedia_wakil}</w:t>
-            </w:r>
-          </w:p>
-          <w:p>
-            <w:pPr>
-              <w:spacing w:line="276" w:lineRule="auto"/>
-              <w:jc w:val="center"/>
-              <w:rPr>
-                <w:rFonts w:ascii="Arial" w:hAnsi="Arial" w:cs="Arial"/>
-              </w:rPr>
-            </w:pPr>
-            <w:r>
-              <w:rPr>
-                <w:rFonts w:ascii="Arial" w:eastAsia="Basic" w:hAnsi="Arial" w:cs="Arial"/>
-                <w:lang w:val="en-US"/>
-              </w:rPr>
-              <w:t xml:space="preserve">${penyedia_jabatan}</w:t>
             </w:r>
           </w:p>
         </w:tc>
@@ -2296,6 +2172,12 @@
               <w:bottom w:val="none" w:sz="0" w:space="0" w:color="FFFFFF"/>
               <w:right w:val="none" w:sz="0" w:space="0" w:color="FFFFFF"/>
             </w:tcBorders>
+            <w:tcMar>
+              <w:top w:w="0" w:type="dxa"/>
+              <w:bottom w:w="0" w:type="dxa"/>
+              <w:left w:w="0" w:type="dxa"/>
+              <w:right w:w="0" w:type="dxa"/>
+            </w:tcMar>
           </w:tcPr>
           <w:p>
             <w:pPr>
@@ -2354,101 +2236,72 @@
               <w:t xml:space="preserve">${ppk_tanda_tangan_jabatan2}</w:t>
             </w:r>
           </w:p>
-          <w:p>
-            <w:pPr>
-              <w:spacing w:line="276" w:lineRule="auto"/>
+        </w:tc>
+      </w:tr>
+      <w:tr>
+        <w:tc>
+          <w:tcPr>
+            <w:tcW w:type="dxa" w:w="4513"/>
+            <w:tcMar>
+              <w:top w:w="0" w:type="dxa"/>
+              <w:bottom w:w="0" w:type="dxa"/>
+              <w:left w:w="0" w:type="dxa"/>
+              <w:right w:w="0" w:type="dxa"/>
+            </w:tcMar>
+          </w:tcPr>
+          <w:p>
+            <w:pPr>
+              <w:spacing w:before="1100"/>
               <w:jc w:val="center"/>
-              <w:rPr>
-                <w:rFonts w:ascii="Arial" w:eastAsia="Arial" w:hAnsi="Arial" w:cs="Arial"/>
+            </w:pPr>
+            <w:r>
+              <w:rPr>
                 <w:b/>
-                <w:bCs/>
-                <w:lang w:val="en-US"/>
-              </w:rPr>
-            </w:pPr>
-          </w:p>
-          <w:p>
-            <w:pPr>
-              <w:spacing w:line="276" w:lineRule="auto"/>
+                <w:u w:val="single"/>
+              </w:rPr>
+              <w:t>${penyedia_wakil}</w:t>
+            </w:r>
+          </w:p>
+          <w:p>
+            <w:pPr>
+              <w:spacing w:after="0"/>
               <w:jc w:val="center"/>
-              <w:rPr>
-                <w:rFonts w:ascii="Arial" w:eastAsia="Arial" w:hAnsi="Arial" w:cs="Arial"/>
+            </w:pPr>
+            <w:r>
+              <w:t>${penyedia_jabatan}</w:t>
+            </w:r>
+          </w:p>
+        </w:tc>
+        <w:tc>
+          <w:tcPr>
+            <w:tcW w:type="dxa" w:w="4513"/>
+            <w:tcMar>
+              <w:top w:w="0" w:type="dxa"/>
+              <w:bottom w:w="0" w:type="dxa"/>
+              <w:left w:w="0" w:type="dxa"/>
+              <w:right w:w="0" w:type="dxa"/>
+            </w:tcMar>
+          </w:tcPr>
+          <w:p>
+            <w:pPr>
+              <w:spacing w:before="1100"/>
+              <w:jc w:val="center"/>
+            </w:pPr>
+            <w:r>
+              <w:rPr>
                 <w:b/>
-                <w:bCs/>
-                <w:lang w:val="en-US"/>
-              </w:rPr>
-            </w:pPr>
-          </w:p>
-          <w:p>
-            <w:pPr>
-              <w:spacing w:line="276" w:lineRule="auto"/>
-              <w:rPr>
-                <w:rFonts w:ascii="Arial" w:eastAsia="Arial" w:hAnsi="Arial" w:cs="Arial"/>
-                <w:b/>
-                <w:bCs/>
-                <w:lang w:val="en-US"/>
-              </w:rPr>
-            </w:pPr>
-          </w:p>
-          <w:p>
-            <w:pPr>
-              <w:spacing w:line="276" w:lineRule="auto"/>
-              <w:rPr>
-                <w:rFonts w:ascii="Arial" w:eastAsia="Arial" w:hAnsi="Arial" w:cs="Arial"/>
-                <w:b/>
-                <w:bCs/>
-                <w:lang w:val="en-US"/>
-              </w:rPr>
-            </w:pPr>
-          </w:p>
-          <w:p>
-            <w:pPr>
-              <w:spacing w:line="276" w:lineRule="auto"/>
+                <w:u w:val="single"/>
+              </w:rPr>
+              <w:t>${ppk_nama}</w:t>
+            </w:r>
+          </w:p>
+          <w:p>
+            <w:pPr>
+              <w:spacing w:after="0"/>
               <w:jc w:val="center"/>
-              <w:rPr>
-                <w:rFonts w:ascii="Arial" w:eastAsia="Arial" w:hAnsi="Arial" w:cs="Arial"/>
-                <w:b/>
-                <w:bCs/>
-                <w:lang w:val="en-US"/>
-              </w:rPr>
-            </w:pPr>
-          </w:p>
-          <w:p>
-            <w:pPr>
-              <w:spacing w:line="276" w:lineRule="auto"/>
-              <w:jc w:val="center"/>
-              <w:rPr>
-                <w:rFonts w:ascii="Arial" w:eastAsia="Arial" w:hAnsi="Arial" w:cs="Arial"/>
-                <w:b/>
-                <w:bCs/>
-                <w:u w:val="single"/>
-                <w:lang w:val="en-US"/>
-              </w:rPr>
-            </w:pPr>
-            <w:r>
-              <w:rPr>
-                <w:rFonts w:ascii="Arial" w:eastAsia="Arial" w:hAnsi="Arial" w:cs="Arial"/>
-                <w:b/>
-                <w:bCs/>
-                <w:u w:val="single"/>
-                <w:lang w:val="en-US"/>
-              </w:rPr>
-              <w:t xml:space="preserve">${ppk_nama}</w:t>
-            </w:r>
-          </w:p>
-          <w:p>
-            <w:pPr>
-              <w:spacing w:line="276" w:lineRule="auto"/>
-              <w:jc w:val="center"/>
-              <w:rPr>
-                <w:rFonts w:ascii="Arial" w:hAnsi="Arial" w:cs="Arial"/>
-              </w:rPr>
-            </w:pPr>
-            <w:r>
-              <w:rPr>
-                <w:rFonts w:ascii="Arial" w:eastAsia="Arial" w:hAnsi="Arial" w:cs="Arial"/>
-                <w:lang w:val="en-US"/>
-              </w:rPr>
-              <w:t xml:space="preserve">NIP. ${ppk_nip}</w:t>
+            </w:pPr>
+            <w:r>
+              <w:t>NIP. ${ppk_nip}</w:t>
             </w:r>
           </w:p>
         </w:tc>

</xml_diff>